<commit_message>
cascade: chore(doc-exports): regenerate four-format HTML/PDF/DOCX governance+readme exports across owned submodules + add NDK jni/Android.mk build sources (nova native deps) [§11.4.65/§11.4.73/§11.4.153]
(committed by parent commit_all.sh --auto-cascade depth=1)
</commit_message>
<xml_diff>
--- a/readme.docx
+++ b/readme.docx
@@ -26,7 +26,7 @@
       <w:r>
         <w:drawing>
           <wp:inline>
-            <wp:extent cx="876300" cy="190500"/>
+            <wp:extent cx="971550" cy="190500"/>
             <wp:effectExtent b="0" l="0" r="0" t="0"/>
             <wp:docPr descr="GitHub" title="" id="10" name="Picture"/>
             <a:graphic>
@@ -56,7 +56,7 @@
                   <pic:spPr bwMode="auto">
                     <a:xfrm>
                       <a:off x="0" y="0"/>
-                      <a:ext cx="876300" cy="190500"/>
+                      <a:ext cx="971550" cy="190500"/>
                     </a:xfrm>
                     <a:prstGeom prst="rect">
                       <a:avLst/>
@@ -80,7 +80,7 @@
       <w:r>
         <w:drawing>
           <wp:inline>
-            <wp:extent cx="2743200" cy="190500"/>
+            <wp:extent cx="762000" cy="190500"/>
             <wp:effectExtent b="0" l="0" r="0" t="0"/>
             <wp:docPr descr="GitHub tag (with filter)" title="" id="13" name="Picture"/>
             <a:graphic>
@@ -110,7 +110,7 @@
                   <pic:spPr bwMode="auto">
                     <a:xfrm>
                       <a:off x="0" y="0"/>
-                      <a:ext cx="2743200" cy="190500"/>
+                      <a:ext cx="762000" cy="190500"/>
                     </a:xfrm>
                     <a:prstGeom prst="rect">
                       <a:avLst/>

</xml_diff>